<commit_message>
Add collection slideshow and compact mobile assistant with updated requirements
</commit_message>
<xml_diff>
--- a/docs/Gem-Crystal-Platform-PRD.docx
+++ b/docs/Gem-Crystal-Platform-PRD.docx
@@ -202,16 +202,8 @@
             <w:vAlign w:val="center"/>
           </w:tcPr>
           <w:p>
-            <w:pPr>
-              <w:spacing w:after="0"/>
-            </w:pPr>
             <w:r>
-              <w:rPr>
-                <w:rFonts w:ascii="Calibri" w:hAnsi="Calibri"/>
-                <w:color w:val="202124"/>
-                <w:sz w:val="20"/>
-              </w:rPr>
-              <w:t>1.0 — pre-launch baseline</w:t>
+              <w:t>1.1 - storefront experience update</w:t>
             </w:r>
           </w:p>
         </w:tc>
@@ -256,16 +248,8 @@
             <w:vAlign w:val="center"/>
           </w:tcPr>
           <w:p>
-            <w:pPr>
-              <w:spacing w:after="0"/>
-            </w:pPr>
             <w:r>
-              <w:rPr>
-                <w:rFonts w:ascii="Calibri" w:hAnsi="Calibri"/>
-                <w:color w:val="202124"/>
-                <w:sz w:val="20"/>
-              </w:rPr>
-              <w:t>4 September 2026</w:t>
+              <w:t>8 October 2026</w:t>
             </w:r>
           </w:p>
         </w:tc>
@@ -2838,6 +2822,96 @@
         <w:t>Store staff need a short procedure for pending payments and an owner escalation path.</w:t>
       </w:r>
     </w:p>
+    <w:p>
+      <w:r>
+        <w:br w:type="page"/>
+      </w:r>
+    </w:p>
+    <w:p>
+      <w:pPr>
+        <w:pStyle w:val="Heading1"/>
+      </w:pPr>
+      <w:r>
+        <w:t>Storefront experience update October 2026</w:t>
+      </w:r>
+    </w:p>
+    <w:p>
+      <w:pPr>
+        <w:pStyle w:val="ListBullet"/>
+      </w:pPr>
+      <w:r>
+        <w:t>Preserve the original black and pink boutique identity, with clear merchandise grids, responsive navigation and explicit size/colour selection.</w:t>
+      </w:r>
+    </w:p>
+    <w:p>
+      <w:pPr>
+        <w:pStyle w:val="ListBullet"/>
+      </w:pPr>
+      <w:r>
+        <w:t>The top campaign below navigation contains four slides: women's clothing, men's clothing, sneakers and new arrivals. Each offers a corresponding catalogue action, previous/next controls and a labelled slide selector.</w:t>
+      </w:r>
+    </w:p>
+    <w:p>
+      <w:pPr>
+        <w:pStyle w:val="ListBullet"/>
+      </w:pPr>
+      <w:r>
+        <w:t>Customers can pause automatic rotation. Rotation pauses during interaction and honours reduced-motion preferences.</w:t>
+      </w:r>
+    </w:p>
+    <w:p>
+      <w:pPr>
+        <w:pStyle w:val="ListBullet"/>
+      </w:pPr>
+      <w:r>
+        <w:t>Product records, prices and stock come only from the API. Campaign photography is promotional imagery, not evidence of a particular product's availability. An unavailable or empty catalogue must remain honest; no demo catalogue or fake customer/admin login is allowed.</w:t>
+      </w:r>
+    </w:p>
+    <w:p>
+      <w:pPr>
+        <w:pStyle w:val="ListBullet"/>
+      </w:pPr>
+      <w:r>
+        <w:t>The slogan "Be bold. Be bright. Be you." is prominently sized and bold on desktop and phones.</w:t>
+      </w:r>
+    </w:p>
+    <w:p>
+      <w:pPr>
+        <w:pStyle w:val="ListBullet"/>
+      </w:pPr>
+      <w:r>
+        <w:t>Circular WhatsApp and Gem AI controls stay fixed at the bottom with safe-area spacing. They hide while shopping or chat dialogs are open.</w:t>
+      </w:r>
+    </w:p>
+    <w:p>
+      <w:pPr>
+        <w:pStyle w:val="ListBullet"/>
+      </w:pPr>
+      <w:r>
+        <w:t>Gem AI opens in a compact inset panel on phones, with visible close and send controls and a separately scrolling conversation. It must not fill the whole phone screen.</w:t>
+      </w:r>
+    </w:p>
+    <w:p>
+      <w:pPr>
+        <w:pStyle w:val="ListBullet"/>
+      </w:pPr>
+      <w:r>
+        <w:t>The footer displays copyright year 2023 as requested by the owner; this is a fixed display value, not the documentation version date.</w:t>
+      </w:r>
+    </w:p>
+    <w:p>
+      <w:pPr>
+        <w:pStyle w:val="ListBullet"/>
+      </w:pPr>
+      <w:r>
+        <w:t>Every functional or visual change must update the PRD, TRD and relevant project documentation before delivery. Shared Word copies must reflect the same requirements.</w:t>
+      </w:r>
+    </w:p>
+    <w:p>
+      <w:r>
+        <w:t>The POS M-Pesa popup investigation remains unresolved. Daraja simulation acceptance is not proof of callback delivery; verified callback, sale correlation and notification delivery still require end-to-end acceptance testing.</w:t>
+      </w:r>
+    </w:p>
     <w:sectPr>
       <w:headerReference w:type="default" r:id="rId9"/>
       <w:footerReference w:type="default" r:id="rId10"/>

</xml_diff>

<commit_message>
Fix automatic showcase playback and fill photo frames
</commit_message>
<xml_diff>
--- a/docs/Gem-Crystal-Platform-PRD.docx
+++ b/docs/Gem-Crystal-Platform-PRD.docx
@@ -203,7 +203,7 @@
           </w:tcPr>
           <w:p>
             <w:r>
-              <w:t>1.1 - storefront experience update</w:t>
+              <w:t>1.2 - automatic slideshow and image fitting</w:t>
             </w:r>
           </w:p>
         </w:tc>
@@ -2856,7 +2856,23 @@
         <w:pStyle w:val="ListBullet"/>
       </w:pPr>
       <w:r>
-        <w:t>Customers can pause automatic rotation. Rotation pauses during interaction and honours reduced-motion preferences.</w:t>
+        <w:t>Slides advance automatically during ordinary viewing, including pointer hover and mouse interaction with slide selectors. Customers can pause/resume rotation explicitly. Keyboard navigation, hidden-document and reduced-motion safeguards remain supported.</w:t>
+      </w:r>
+    </w:p>
+    <w:p>
+      <w:pPr>
+        <w:pStyle w:val="ListBullet"/>
+      </w:pPr>
+      <w:r>
+        <w:t>Photos fill their slide frames without stretching or blank bands. Per-slide cropping keeps clothing and sneakers visible across desktop and phone layouts; motion transitions honour reduced-motion preferences.</w:t>
+      </w:r>
+    </w:p>
+    <w:p>
+      <w:pPr>
+        <w:pStyle w:val="ListBullet"/>
+      </w:pPr>
+      <w:r>
+        <w:t>Brand text, slide copy and controls remain readable over both promotional photography and live catalogue photos without obscuring the merchandise.</w:t>
       </w:r>
     </w:p>
     <w:p>

</xml_diff>

<commit_message>
Fix mobile carousel touch controls playback and portrait framing
</commit_message>
<xml_diff>
--- a/docs/Gem-Crystal-Platform-PRD.docx
+++ b/docs/Gem-Crystal-Platform-PRD.docx
@@ -203,7 +203,7 @@
           </w:tcPr>
           <w:p>
             <w:r>
-              <w:t>1.2 - automatic slideshow and image fitting</w:t>
+              <w:t>1.3 - recorded phone experience correction</w:t>
             </w:r>
           </w:p>
         </w:tc>
@@ -2856,7 +2856,7 @@
         <w:pStyle w:val="ListBullet"/>
       </w:pPr>
       <w:r>
-        <w:t>Slides advance automatically during ordinary viewing, including pointer hover and mouse interaction with slide selectors. Customers can pause/resume rotation explicitly. Keyboard navigation, hidden-document and reduced-motion safeguards remain supported.</w:t>
+        <w:t>Slides advance automatically every five seconds during ordinary viewing, including touch/pointer interaction with slide selectors. Customers can pause/resume rotation explicitly. Reduced-motion users receive instant slide changes rather than animated transitions; rotation remains available. Keyboard navigation and hidden-document safeguards remain supported.</w:t>
       </w:r>
     </w:p>
     <w:p>
@@ -2873,6 +2873,22 @@
       </w:pPr>
       <w:r>
         <w:t>Brand text, slide copy and controls remain readable over both promotional photography and live catalogue photos without obscuring the merchandise.</w:t>
+      </w:r>
+    </w:p>
+    <w:p>
+      <w:pPr>
+        <w:pStyle w:val="ListBullet"/>
+      </w:pPr>
+      <w:r>
+        <w:t>Phone slides use a taller, subject-aware photo frame so clothing or shoes are actually visible, not a thin strip of background above a model's head. Verify the deployed catalogue photography from the owner's phone recording, not only generic fixtures. Preserve the approved desktop layout.</w:t>
+      </w:r>
+    </w:p>
+    <w:p>
+      <w:pPr>
+        <w:pStyle w:val="ListBullet"/>
+      </w:pPr>
+      <w:r>
+        <w:t>Customers must be able to tap every mobile carousel control; invisible text layers must not intercept those taps. Verify real touch hit targets as well as visible layout.</w:t>
       </w:r>
     </w:p>
     <w:p>

</xml_diff>

<commit_message>
Document verified POS payment flow and regression audit
</commit_message>
<xml_diff>
--- a/docs/Gem-Crystal-Platform-PRD.docx
+++ b/docs/Gem-Crystal-Platform-PRD.docx
@@ -203,7 +203,7 @@
           </w:tcPr>
           <w:p>
             <w:r>
-              <w:t>1.3 - recorded phone experience correction</w:t>
+              <w:t>1.4 - payment diagnostics and cashier monitoring</w:t>
             </w:r>
           </w:p>
         </w:tc>
@@ -2944,6 +2944,62 @@
         <w:t>The POS M-Pesa popup investigation remains unresolved. Daraja simulation acceptance is not proof of callback delivery; verified callback, sale correlation and notification delivery still require end-to-end acceptance testing.</w:t>
       </w:r>
     </w:p>
+    <w:p>
+      <w:r>
+        <w:br w:type="page"/>
+      </w:r>
+    </w:p>
+    <w:p>
+      <w:pPr>
+        <w:pStyle w:val="Heading1"/>
+      </w:pPr>
+      <w:r>
+        <w:t>Payment workflow update October 2026</w:t>
+      </w:r>
+    </w:p>
+    <w:p>
+      <w:r>
+        <w:t>This update supersedes earlier descriptions of the primary payment flow. The active checkout uses C2B Till payments. STK callbacks remain separate legacy endpoints. Live callback delivery for the reported POS sales has not yet been verified.</w:t>
+      </w:r>
+    </w:p>
+    <w:p>
+      <w:r>
+        <w:t>Create a pending POS sale or website checkout with a server-calculated total before customer payment. Verify the callback secret, shortcode and receipt, then match the exact reference and amount within the payment window.</w:t>
+      </w:r>
+    </w:p>
+    <w:p>
+      <w:r>
+        <w:t>Reference-free, mismatched or expired payments require owner review. Amount alone must not determine which customer or sale is paid.</w:t>
+      </w:r>
+    </w:p>
+    <w:p>
+      <w:r>
+        <w:t>Verified POS payments create one durable alert for the creating cashier, including after sign-in again. Cashier confirmation completes the sale and deducts stock. Notification acknowledgement follows completion.</w:t>
+      </w:r>
+    </w:p>
+    <w:p>
+      <w:r>
+        <w:t>The POS must warn when payment checks fail or time out and retry automatically. Device connectivity alone does not establish payment service availability.</w:t>
+      </w:r>
+    </w:p>
+    <w:p>
+      <w:r>
+        <w:t>Callback URL registration must require explicit provider success. Owner registration through the admin uses the hosted configuration and correctly encodes callback secrets.</w:t>
+      </w:r>
+    </w:p>
+    <w:p>
+      <w:pPr>
+        <w:pStyle w:val="Heading2"/>
+      </w:pPr>
+      <w:r>
+        <w:t>Verification status</w:t>
+      </w:r>
+    </w:p>
+    <w:p>
+      <w:r>
+        <w:t>API unit tests and TypeScript build passed; POS 10 tests and production build passed. All 16 integration tests passed against an isolated PostgreSQL database, including exact-reference callback delivery, deduplication, cashier isolation, completion and acknowledgement. Hosted Daraja delivery and the reported sales GCPOSECE8C8 and GCPOSA5E9A6 remain unverified.</w:t>
+      </w:r>
+    </w:p>
     <w:sectPr>
       <w:headerReference w:type="default" r:id="rId9"/>
       <w:footerReference w:type="default" r:id="rId10"/>

</xml_diff>

<commit_message>
Document API dependency security patch and CI gate
</commit_message>
<xml_diff>
--- a/docs/Gem-Crystal-Platform-PRD.docx
+++ b/docs/Gem-Crystal-Platform-PRD.docx
@@ -3000,6 +3000,11 @@
         <w:t>API unit tests and TypeScript build passed; POS 10 tests and production build passed. All 16 integration tests passed against an isolated PostgreSQL database, including exact-reference callback delivery, deduplication, cashier isolation, completion and acknowledgement. Hosted Daraja delivery and the reported sales GCPOSECE8C8 and GCPOSA5E9A6 remain unverified.</w:t>
       </w:r>
     </w:p>
+    <w:p>
+      <w:r>
+        <w:t>API release checks must pass the production dependency audit without high or critical findings. The 8 October CI follow-up updates compression to 1.8.2 and proxy-addr to 2.0.8. The local audit reports zero vulnerabilities; the API build, unit tests and backup tests pass. This correction preserves the security gate and does not establish live Daraja callback delivery.</w:t>
+      </w:r>
+    </w:p>
     <w:sectPr>
       <w:headerReference w:type="default" r:id="rId9"/>
       <w:footerReference w:type="default" r:id="rId10"/>

</xml_diff>

<commit_message>
Document gender-aware product creation and Cloudinary upload requirements
</commit_message>
<xml_diff>
--- a/docs/Gem-Crystal-Platform-PRD.docx
+++ b/docs/Gem-Crystal-Platform-PRD.docx
@@ -3005,6 +3005,76 @@
         <w:t>API release checks must pass the production dependency audit without high or critical findings. The 8 October CI follow-up updates compression to 1.8.2 and proxy-addr to 2.0.8. The local audit reports zero vulnerabilities; the API build, unit tests and backup tests pass. This correction preserves the security gate and does not establish live Daraja callback delivery.</w:t>
       </w:r>
     </w:p>
+    <w:p>
+      <w:r>
+        <w:br w:type="page"/>
+      </w:r>
+    </w:p>
+    <w:p>
+      <w:pPr>
+        <w:pStyle w:val="Heading1"/>
+      </w:pPr>
+      <w:r>
+        <w:t>Admin product creation update October 2026</w:t>
+      </w:r>
+    </w:p>
+    <w:p>
+      <w:r>
+        <w:t>Version 1.5 records gender-aware category selection and the confirmed Cloudinary upload requirement for the admin product form.</w:t>
+      </w:r>
+    </w:p>
+    <w:p>
+      <w:pPr>
+        <w:pStyle w:val="Heading2"/>
+      </w:pPr>
+      <w:r>
+        <w:t>Category selection</w:t>
+      </w:r>
+    </w:p>
+    <w:p>
+      <w:r>
+        <w:t>Store Category follows the selected gender using the existing storefront taxonomy. Shared categories, including Sneakers and Hoodies, remain available for women, men and unisex products. Changing gender retains a compatible selection or selects the first valid category.</w:t>
+      </w:r>
+    </w:p>
+    <w:p>
+      <w:pPr>
+        <w:pStyle w:val="Heading2"/>
+      </w:pPr>
+      <w:r>
+        <w:t>Product photo storage</w:t>
+      </w:r>
+    </w:p>
+    <w:p>
+      <w:r>
+        <w:t>Device-selected product photos must upload to Cloudinary before publishing. Product records contain confirmed hosted image URLs, not local paths or temporary browser previews. Accept JPEG, PNG and WEBP files, up to four per upload, 5 MB per file and twelve images per product.</w:t>
+      </w:r>
+    </w:p>
+    <w:p>
+      <w:pPr>
+        <w:pStyle w:val="Heading2"/>
+      </w:pPr>
+      <w:r>
+        <w:t>Failure handling</w:t>
+      </w:r>
+    </w:p>
+    <w:p>
+      <w:r>
+        <w:t>Publishing is unavailable during an upload and until an image has uploaded successfully. Show upload failures and allow retry. Prevent closing the form or changing the uploaded image list while an upload or submission is pending.</w:t>
+      </w:r>
+    </w:p>
+    <w:p>
+      <w:pPr>
+        <w:pStyle w:val="Heading2"/>
+      </w:pPr>
+      <w:r>
+        <w:t>Verification status</w:t>
+      </w:r>
+    </w:p>
+    <w:p>
+      <w:r>
+        <w:t>On 8 October 2026, all ten admin unit tests and the production build passed. An isolated browser test verified category changes, multipart upload, the pending-upload publish lock and the final product payload. API and Cloudinary responses were mocked; actual hosted Cloudinary storage was not exercised. Verify an intended product photo in the configured Cloudinary account before treating hosted storage as accepted.</w:t>
+      </w:r>
+    </w:p>
     <w:sectPr>
       <w:headerReference w:type="default" r:id="rId9"/>
       <w:footerReference w:type="default" r:id="rId10"/>

</xml_diff>